<commit_message>
Modified some Discussion 3 Exercise file media paths
</commit_message>
<xml_diff>
--- a/Module 5 - Video Converting/Discussion 3/Discussion 3.docx
+++ b/Module 5 - Video Converting/Discussion 3/Discussion 3.docx
@@ -341,6 +341,207 @@
         </w:rPr>
         <w:t>Attach the certificate showing the completion of the video.</w:t>
       </w:r>
+    </w:p>
+    <w:p>
+      <w:pPr>
+        <w:rPr>
+          <w:rFonts w:ascii="Lato" w:hAnsi="Lato"/>
+          <w:color w:val="202122"/>
+          <w:spacing w:val="3"/>
+          <w:sz w:val="29"/>
+          <w:szCs w:val="29"/>
+        </w:rPr>
+      </w:pPr>
+      <w:r>
+        <w:rPr>
+          <w:rFonts w:ascii="Lato" w:hAnsi="Lato"/>
+          <w:color w:val="202122"/>
+          <w:spacing w:val="3"/>
+          <w:sz w:val="29"/>
+          <w:szCs w:val="29"/>
+        </w:rPr>
+        <w:br w:type="page"/>
+      </w:r>
+    </w:p>
+    <w:p>
+      <w:pPr>
+        <w:pStyle w:val="Heading3"/>
+      </w:pPr>
+      <w:r>
+        <w:lastRenderedPageBreak/>
+        <w:t>Discussion 3 – Learning Web Audio and Video Reflection</w:t>
+      </w:r>
+    </w:p>
+    <w:p>
+      <w:pPr>
+        <w:pStyle w:val="p3"/>
+        <w:spacing w:line="480" w:lineRule="auto"/>
+        <w:ind w:firstLine="720"/>
+      </w:pPr>
+      <w:r>
+        <w:t xml:space="preserve">Before watching this video, I already had some experience working with audio in web development, particularly through experimenting with the Web Audio API and building small interactive sound projects. However, my experience with native HTML5 video elements and custom media controls was more limited. Most of my prior exposure involved basic </w:t>
+      </w:r>
+      <w:r>
+        <w:rPr>
+          <w:rStyle w:val="s2"/>
+          <w:rFonts w:eastAsiaTheme="majorEastAsia"/>
+        </w:rPr>
+        <w:t>&lt;audio&gt;</w:t>
+      </w:r>
+      <w:r>
+        <w:t xml:space="preserve"> and </w:t>
+      </w:r>
+      <w:r>
+        <w:rPr>
+          <w:rStyle w:val="s2"/>
+          <w:rFonts w:eastAsiaTheme="majorEastAsia"/>
+        </w:rPr>
+        <w:t>&lt;video&gt;</w:t>
+      </w:r>
+      <w:r>
+        <w:t xml:space="preserve"> tags rather than fully customizing playback behavior, time tracking, and user interaction. This video helped bridge that gap by showing how audio and video can be treated as programmable media elements rather than just embedded content.</w:t>
+      </w:r>
+    </w:p>
+    <w:p>
+      <w:pPr>
+        <w:pStyle w:val="p3"/>
+        <w:spacing w:line="480" w:lineRule="auto"/>
+        <w:ind w:firstLine="720"/>
+      </w:pPr>
+      <w:r>
+        <w:t xml:space="preserve">From this video, I learned how to build custom media controls using JavaScript instead of relying on the browser’s default UI. Following along with the exercise files, I created and modified files that implemented play and pause controls, time displays, and a clickable progress bar that allows seeking within the video. I found it especially helpful to see how media events like </w:t>
+      </w:r>
+      <w:r>
+        <w:rPr>
+          <w:rStyle w:val="s2"/>
+          <w:rFonts w:eastAsiaTheme="majorEastAsia"/>
+        </w:rPr>
+        <w:t>loadedmetadata</w:t>
+      </w:r>
+      <w:r>
+        <w:t xml:space="preserve"> and </w:t>
+      </w:r>
+      <w:r>
+        <w:rPr>
+          <w:rStyle w:val="s2"/>
+          <w:rFonts w:eastAsiaTheme="majorEastAsia"/>
+        </w:rPr>
+        <w:t>timeupdate</w:t>
+      </w:r>
+      <w:r>
+        <w:t xml:space="preserve"> are used to synchronize the UI with the video’s current playback state. The exercise files were easy to follow, and the step-by-step approach made the logic behind each function clear, especially how current time and duration values are calculated and displayed.</w:t>
+      </w:r>
+    </w:p>
+    <w:p>
+      <w:pPr>
+        <w:pStyle w:val="p3"/>
+        <w:spacing w:line="480" w:lineRule="auto"/>
+        <w:ind w:firstLine="720"/>
+      </w:pPr>
+      <w:r>
+        <w:t>Seeing a different approach to handling audio and video in the browser was very useful, especially since it focused on native web standards rather than external libraries. The tutorial reinforced how much control developers have over media elements using plain JavaScript and CSS, which made the topic feel more approachable and flexible. Overall, the video strengthened my understanding of how interactive media fits into modern web development</w:t>
+      </w:r>
+      <w:r>
+        <w:t xml:space="preserve">. It also </w:t>
+      </w:r>
+      <w:r>
+        <w:t>gave me practical examples that I can reuse or expand on in future projects.</w:t>
+      </w:r>
+    </w:p>
+    <w:p>
+      <w:pPr>
+        <w:spacing w:before="100" w:beforeAutospacing="1" w:after="100" w:afterAutospacing="1" w:line="240" w:lineRule="auto"/>
+        <w:ind w:left="720"/>
+        <w:rPr>
+          <w:rFonts w:ascii="Lato" w:hAnsi="Lato"/>
+          <w:color w:val="202122"/>
+          <w:spacing w:val="3"/>
+          <w:sz w:val="29"/>
+          <w:szCs w:val="29"/>
+        </w:rPr>
+      </w:pPr>
+      <w:r>
+        <w:rPr>
+          <w:rFonts w:ascii="Lato" w:hAnsi="Lato"/>
+          <w:color w:val="202122"/>
+          <w:spacing w:val="3"/>
+          <w:sz w:val="29"/>
+          <w:szCs w:val="29"/>
+        </w:rPr>
+        <w:lastRenderedPageBreak/>
+        <w:t>Reply to Frank,</w:t>
+      </w:r>
+    </w:p>
+    <w:p>
+      <w:pPr>
+        <w:pStyle w:val="p1"/>
+      </w:pPr>
+      <w:r>
+        <w:t xml:space="preserve">I can </w:t>
+      </w:r>
+      <w:r>
+        <w:t>relate</w:t>
+      </w:r>
+      <w:r>
+        <w:t xml:space="preserve"> to that experience. It also took me some time to understand the exercise files at first, especially when my video wasn’t playing as expected</w:t>
+      </w:r>
+      <w:r>
+        <w:t xml:space="preserve">. After browsing the developer tools, I released it was a file path issue. </w:t>
+      </w:r>
+      <w:r>
+        <w:t xml:space="preserve">Fixing </w:t>
+      </w:r>
+      <w:r>
+        <w:t>those</w:t>
+      </w:r>
+      <w:r>
+        <w:t xml:space="preserve"> file paths for the audio and video cleared everything up, and it was a good reminder of how important directory structure </w:t>
+      </w:r>
+      <w:r>
+        <w:t>is</w:t>
+      </w:r>
+      <w:r>
+        <w:t xml:space="preserve"> when working with media on the web.</w:t>
+      </w:r>
+    </w:p>
+    <w:p>
+      <w:pPr>
+        <w:pStyle w:val="p1"/>
+      </w:pPr>
+      <w:r>
+        <w:t xml:space="preserve">I like how you pointed out that recreating the project from scratch </w:t>
+      </w:r>
+      <w:r>
+        <w:t>turned</w:t>
+      </w:r>
+      <w:r>
+        <w:t xml:space="preserve"> into a strength rather than a setback. Using the browser’s developer tools to track down JavaScript typos is a </w:t>
+      </w:r>
+      <w:r>
+        <w:t>valuable</w:t>
+      </w:r>
+      <w:r>
+        <w:t xml:space="preserve"> habit, and this video was a great way to reinforce that workflow. It </w:t>
+      </w:r>
+      <w:r>
+        <w:t>felt</w:t>
+      </w:r>
+      <w:r>
+        <w:t xml:space="preserve"> like one of those lessons where the hands-on troubleshooting made the concepts stick more.</w:t>
+      </w:r>
+    </w:p>
+    <w:p>
+      <w:pPr>
+        <w:spacing w:before="100" w:beforeAutospacing="1" w:after="100" w:afterAutospacing="1" w:line="240" w:lineRule="auto"/>
+        <w:ind w:left="720"/>
+        <w:rPr>
+          <w:rFonts w:ascii="Lato" w:hAnsi="Lato"/>
+          <w:color w:val="202122"/>
+          <w:spacing w:val="3"/>
+          <w:sz w:val="29"/>
+          <w:szCs w:val="29"/>
+        </w:rPr>
+      </w:pPr>
     </w:p>
     <w:p/>
     <w:sectPr>
@@ -1113,7 +1314,6 @@
     <w:next w:val="Normal"/>
     <w:link w:val="Heading3Char"/>
     <w:uiPriority w:val="9"/>
-    <w:semiHidden/>
     <w:unhideWhenUsed/>
     <w:qFormat/>
     <w:rsid w:val="004A0215"/>
@@ -1321,7 +1521,6 @@
     <w:basedOn w:val="DefaultParagraphFont"/>
     <w:link w:val="Heading3"/>
     <w:uiPriority w:val="9"/>
-    <w:semiHidden/>
     <w:rsid w:val="004A0215"/>
     <w:rPr>
       <w:rFonts w:eastAsiaTheme="majorEastAsia" w:cstheme="majorBidi"/>
@@ -1616,6 +1815,60 @@
       <w:kern w:val="0"/>
       <w14:ligatures w14:val="none"/>
     </w:rPr>
+  </w:style>
+  <w:style w:type="paragraph" w:customStyle="1" w:styleId="p2">
+    <w:name w:val="p2"/>
+    <w:basedOn w:val="Normal"/>
+    <w:rsid w:val="001229C1"/>
+    <w:pPr>
+      <w:spacing w:before="100" w:beforeAutospacing="1" w:after="100" w:afterAutospacing="1" w:line="240" w:lineRule="auto"/>
+    </w:pPr>
+    <w:rPr>
+      <w:rFonts w:ascii="Times New Roman" w:eastAsia="Times New Roman" w:hAnsi="Times New Roman" w:cs="Times New Roman"/>
+      <w:kern w:val="0"/>
+      <w14:ligatures w14:val="none"/>
+    </w:rPr>
+  </w:style>
+  <w:style w:type="paragraph" w:customStyle="1" w:styleId="p3">
+    <w:name w:val="p3"/>
+    <w:basedOn w:val="Normal"/>
+    <w:rsid w:val="001229C1"/>
+    <w:pPr>
+      <w:spacing w:before="100" w:beforeAutospacing="1" w:after="100" w:afterAutospacing="1" w:line="240" w:lineRule="auto"/>
+    </w:pPr>
+    <w:rPr>
+      <w:rFonts w:ascii="Times New Roman" w:eastAsia="Times New Roman" w:hAnsi="Times New Roman" w:cs="Times New Roman"/>
+      <w:kern w:val="0"/>
+      <w14:ligatures w14:val="none"/>
+    </w:rPr>
+  </w:style>
+  <w:style w:type="character" w:customStyle="1" w:styleId="s2">
+    <w:name w:val="s2"/>
+    <w:basedOn w:val="DefaultParagraphFont"/>
+    <w:rsid w:val="001229C1"/>
+  </w:style>
+  <w:style w:type="character" w:customStyle="1" w:styleId="apple-converted-space">
+    <w:name w:val="apple-converted-space"/>
+    <w:basedOn w:val="DefaultParagraphFont"/>
+    <w:rsid w:val="001229C1"/>
+  </w:style>
+  <w:style w:type="paragraph" w:customStyle="1" w:styleId="p1">
+    <w:name w:val="p1"/>
+    <w:basedOn w:val="Normal"/>
+    <w:rsid w:val="00E33D58"/>
+    <w:pPr>
+      <w:spacing w:before="100" w:beforeAutospacing="1" w:after="100" w:afterAutospacing="1" w:line="240" w:lineRule="auto"/>
+    </w:pPr>
+    <w:rPr>
+      <w:rFonts w:ascii="Times New Roman" w:eastAsia="Times New Roman" w:hAnsi="Times New Roman" w:cs="Times New Roman"/>
+      <w:kern w:val="0"/>
+      <w14:ligatures w14:val="none"/>
+    </w:rPr>
+  </w:style>
+  <w:style w:type="character" w:customStyle="1" w:styleId="s1">
+    <w:name w:val="s1"/>
+    <w:basedOn w:val="DefaultParagraphFont"/>
+    <w:rsid w:val="00E33D58"/>
   </w:style>
 </w:styles>
 </file>

</xml_diff>